<commit_message>
Thesis text: Tanzania methods section and North Sea vs Tanzania comparison chapter
Methods section 10 describes the site, gas platform, line pack and MEG levers,
hot-climate derating, fuel and validation. New chapter comparison.md (+ .docx)
with Table C1, Figures 11-13 and the finding that the flexibility benefit scales
with the hours of load that can be postponed (line pack 3.6 h vs injection 72 h).
</commit_message>
<xml_diff>
--- a/docs/thesis/methods.docx
+++ b/docs/thesis/methods.docx
@@ -2,7 +2,7 @@
 <file path=word/document.xml><?xml version="1.0" encoding="utf-8"?>
 <w:document xmlns:w="http://schemas.openxmlformats.org/wordprocessingml/2006/main" xmlns:m="http://schemas.openxmlformats.org/officeDocument/2006/math" xmlns:r="http://schemas.openxmlformats.org/officeDocument/2006/relationships" xmlns:o="urn:schemas-microsoft-com:office:office" xmlns:v="urn:schemas-microsoft-com:vml" xmlns:w10="urn:schemas-microsoft-com:office:word" xmlns:a="http://schemas.openxmlformats.org/drawingml/2006/main" xmlns:pic="http://schemas.openxmlformats.org/drawingml/2006/picture" xmlns:wp="http://schemas.openxmlformats.org/drawingml/2006/wordprocessingDrawing">
   <w:body>
-    <w:bookmarkStart w:id="30" w:name="methods"/>
+    <w:bookmarkStart w:id="33" w:name="methods"/>
     <w:p>
       <w:pPr>
         <w:pStyle w:val="Heading1"/>
@@ -2914,13 +2914,13 @@
       </w:r>
     </w:p>
     <w:bookmarkEnd w:id="28"/>
-    <w:bookmarkStart w:id="29" w:name="references"/>
+    <w:bookmarkStart w:id="29" w:name="Xd90a2aa44459819cf19b462991e82ce0bd4a26d"/>
     <w:p>
       <w:pPr>
         <w:pStyle w:val="Heading2"/>
       </w:pPr>
       <w:r>
-        <w:t xml:space="preserve">References</w:t>
+        <w:t xml:space="preserve">10 Comparison site: deepwater gas off southern Tanzania</w:t>
       </w:r>
     </w:p>
     <w:p>
@@ -2928,23 +2928,490 @@
         <w:pStyle w:val="FirstParagraph"/>
       </w:pPr>
       <w:r>
-        <w:t xml:space="preserve">Gaertner, E. et al. (2020).</w:t>
-      </w:r>
-      <w:r>
-        <w:t xml:space="preserve"> </w:t>
-      </w:r>
+        <w:t xml:space="preserve">To test whether the result depends on the North Sea setting, the same model</w:t>
+      </w:r>
+      <w:r>
+        <w:t xml:space="preserve"> </w:t>
+      </w:r>
+      <w:r>
+        <w:t xml:space="preserve">is applied to a second, contrasting site. Only what differs is set in a</w:t>
+      </w:r>
+      <w:r>
+        <w:t xml:space="preserve"> </w:t>
+      </w:r>
+      <w:r>
+        <w:t xml:space="preserve">separate configuration (</w:t>
+      </w:r>
+      <w:r>
+        <w:rPr>
+          <w:rStyle w:val="VerbatimChar"/>
+        </w:rPr>
+        <w:t xml:space="preserve">config/tanzania.yaml</w:t>
+      </w:r>
+      <w:r>
+        <w:t xml:space="preserve">), which inherits every other</w:t>
+      </w:r>
+      <w:r>
+        <w:t xml:space="preserve"> </w:t>
+      </w:r>
+      <w:r>
+        <w:t xml:space="preserve">parameter from the base case; the same code, wind turbine, gas turbines,</w:t>
+      </w:r>
+      <w:r>
+        <w:t xml:space="preserve"> </w:t>
+      </w:r>
+      <w:r>
+        <w:t xml:space="preserve">scheduler and cases are used.</w:t>
+      </w:r>
+    </w:p>
+    <w:p>
+      <w:pPr>
+        <w:pStyle w:val="BodyText"/>
+      </w:pPr>
+      <w:r>
+        <w:rPr>
+          <w:bCs/>
+          <w:b/>
+        </w:rPr>
+        <w:t xml:space="preserve">Site and weather.</w:t>
+      </w:r>
+      <w:r>
+        <w:t xml:space="preserve"> </w:t>
+      </w:r>
+      <w:r>
+        <w:t xml:space="preserve">The site is the deepwater gas discoveries in Blocks 1,</w:t>
+      </w:r>
+      <w:r>
+        <w:t xml:space="preserve"> </w:t>
+      </w:r>
+      <w:r>
+        <w:t xml:space="preserve">2 and 4 off Lindi and Mtwara (9.5° S, 40.5° E, water depth 1000–3000 m), the</w:t>
+      </w:r>
+      <w:r>
+        <w:t xml:space="preserve"> </w:t>
+      </w:r>
+      <w:r>
+        <w:t xml:space="preserve">resource behind the planned Tanzania LNG project. Wind, 2 m air temperature</w:t>
+      </w:r>
+      <w:r>
+        <w:t xml:space="preserve"> </w:t>
+      </w:r>
+      <w:r>
+        <w:t xml:space="preserve">and sea-surface temperature for 2023 come from ERA5, processed as in Section</w:t>
+      </w:r>
+      <w:r>
+        <w:t xml:space="preserve"> </w:t>
+      </w:r>
+      <w:r>
+        <w:t xml:space="preserve">2. The two IEA 15 MW turbines are assumed to sit on floating foundations, as</w:t>
+      </w:r>
+      <w:r>
+        <w:t xml:space="preserve"> </w:t>
+      </w:r>
+      <w:r>
+        <w:t xml:space="preserve">at Hywind Tampen; the power curve is unchanged.</w:t>
+      </w:r>
+    </w:p>
+    <w:p>
+      <w:pPr>
+        <w:pStyle w:val="BodyText"/>
+      </w:pPr>
+      <w:r>
+        <w:rPr>
+          <w:bCs/>
+          <w:b/>
+        </w:rPr>
+        <w:t xml:space="preserve">Platform and process.</w:t>
+      </w:r>
+      <w:r>
+        <w:t xml:space="preserve"> </w:t>
+      </w:r>
+      <w:r>
+        <w:t xml:space="preserve">The platform is a hypothetical gas processing</w:t>
+      </w:r>
+      <w:r>
+        <w:t xml:space="preserve"> </w:t>
+      </w:r>
+      <w:r>
+        <w:t xml:space="preserve">platform that sends 10 MSm³/d of dry gas (about a quarter of a two-train</w:t>
+      </w:r>
+      <w:r>
+        <w:t xml:space="preserve"> </w:t>
+      </w:r>
+      <w:r>
+        <w:t xml:space="preserve">LNG plant) through a 100 km, 0.6 m pipeline to shore. The real development</w:t>
+      </w:r>
+      <w:r>
+        <w:t xml:space="preserve"> </w:t>
+      </w:r>
+      <w:r>
+        <w:t xml:space="preserve">concept is subsea wells tied back to an onshore plant, so the platform is a</w:t>
+      </w:r>
+      <w:r>
+        <w:t xml:space="preserve"> </w:t>
+      </w:r>
+      <w:r>
+        <w:t xml:space="preserve">modelling device that makes the two sites comparable, not a description of</w:t>
+      </w:r>
+      <w:r>
+        <w:t xml:space="preserve"> </w:t>
+      </w:r>
+      <w:r>
+        <w:t xml:space="preserve">the project. A lean gas (95.5 mol % methane) arrives at 70 bara and 15 °C.</w:t>
+      </w:r>
+      <w:r>
+        <w:t xml:space="preserve"> </w:t>
+      </w:r>
+      <w:r>
+        <w:t xml:space="preserve">NeqSim (Peng–Robinson) models the inlet separation, condensate</w:t>
+      </w:r>
+      <w:r>
+        <w:t xml:space="preserve"> </w:t>
+      </w:r>
+      <w:r>
+        <w:t xml:space="preserve">stabilisation at 10 bara, and compression of the gas to 150 bara for</w:t>
+      </w:r>
+      <w:r>
+        <w:t xml:space="preserve"> </w:t>
+      </w:r>
+      <w:r>
+        <w:t xml:space="preserve">export, with the same isentropic efficiency as the North Sea compressors.</w:t>
+      </w:r>
+      <w:r>
+        <w:t xml:space="preserve"> </w:t>
+      </w:r>
+      <w:r>
+        <w:t xml:space="preserve">Gas dehydration with triethylene glycol (TEG) and regeneration of the</w:t>
+      </w:r>
+      <w:r>
+        <w:t xml:space="preserve"> </w:t>
+      </w:r>
+      <w:r>
+        <w:t xml:space="preserve">mono-ethylene glycol (MEG) injected into the subsea wells for hydrate</w:t>
+      </w:r>
+      <w:r>
+        <w:t xml:space="preserve"> </w:t>
+      </w:r>
+      <w:r>
+        <w:t xml:space="preserve">control are represented by their heat and electric duties (Table T1). The</w:t>
+      </w:r>
+      <w:r>
+        <w:t xml:space="preserve"> </w:t>
+      </w:r>
+      <w:r>
+        <w:t xml:space="preserve">design electric demand is 16.0 MW, of which export compression is 11.2 MW</w:t>
+      </w:r>
+      <w:r>
+        <w:t xml:space="preserve"> </w:t>
+      </w:r>
+      <w:r>
+        <w:t xml:space="preserve">(70 %).</w:t>
+      </w:r>
+    </w:p>
+    <w:p>
+      <w:pPr>
+        <w:pStyle w:val="BodyText"/>
+      </w:pPr>
+      <w:r>
+        <w:rPr>
+          <w:bCs/>
+          <w:b/>
+        </w:rPr>
+        <w:t xml:space="preserve">Flexibility levers.</w:t>
+      </w:r>
+      <w:r>
+        <w:t xml:space="preserve"> </w:t>
+      </w:r>
+      <w:r>
+        <w:t xml:space="preserve">A gas platform has no water injection, so the two</w:t>
+      </w:r>
+      <w:r>
+        <w:t xml:space="preserve"> </w:t>
+      </w:r>
+      <w:r>
+        <w:t xml:space="preserve">levers are different:</w:t>
+      </w:r>
+    </w:p>
+    <w:p>
+      <w:pPr>
+        <w:numPr>
+          <w:ilvl w:val="0"/>
+          <w:numId w:val="1007"/>
+        </w:numPr>
+        <w:pStyle w:val="Compact"/>
+      </w:pPr>
       <w:r>
         <w:rPr>
           <w:iCs/>
           <w:i/>
         </w:rPr>
-        <w:t xml:space="preserve">Definition of the IEA 15-Megawatt Offshore</w:t>
-      </w:r>
+        <w:t xml:space="preserve">Gas production and line pack.</w:t>
+      </w:r>
+      <w:r>
+        <w:t xml:space="preserve"> </w:t>
+      </w:r>
+      <w:r>
+        <w:t xml:space="preserve">The export pipeline stores gas. Allowing</w:t>
+      </w:r>
+      <w:r>
+        <w:t xml:space="preserve"> </w:t>
+      </w:r>
+      <w:r>
+        <w:t xml:space="preserve">its inlet pressure to swing between 150 and 110 bara stores</w:t>
+      </w:r>
+      <w:r>
+        <w:t xml:space="preserve"> </w:t>
+      </w:r>
+      <w:r>
+        <w:t xml:space="preserve">3.6 h of full-rate production, computed from NeqSim gas densities at the</w:t>
+      </w:r>
+      <w:r>
+        <w:t xml:space="preserve"> </w:t>
+      </w:r>
+      <w:r>
+        <w:t xml:space="preserve">two pressures and the pipeline volume. The platform may produce between</w:t>
+      </w:r>
+      <w:r>
+        <w:t xml:space="preserve"> </w:t>
+      </w:r>
+      <w:r>
+        <w:t xml:space="preserve">50 % and 110 % of the sales rate, as long as the deficit against the sales</w:t>
+      </w:r>
+      <w:r>
+        <w:t xml:space="preserve"> </w:t>
+      </w:r>
+      <w:r>
+        <w:t xml:space="preserve">rate never exceeds the line pack and is repaid by the end of the horizon.</w:t>
+      </w:r>
+      <w:r>
+        <w:t xml:space="preserve"> </w:t>
+      </w:r>
+      <w:r>
+        <w:t xml:space="preserve">Delivered gas, and therefore the LNG plant, is unaffected on average; no</w:t>
+      </w:r>
+      <w:r>
+        <w:t xml:space="preserve"> </w:t>
+      </w:r>
+      <w:r>
+        <w:t xml:space="preserve">production is lost.</w:t>
+      </w:r>
+    </w:p>
+    <w:p>
+      <w:pPr>
+        <w:numPr>
+          <w:ilvl w:val="0"/>
+          <w:numId w:val="1007"/>
+        </w:numPr>
+        <w:pStyle w:val="Compact"/>
+      </w:pPr>
       <w:r>
         <w:rPr>
           <w:iCs/>
           <w:i/>
         </w:rPr>
+        <w:t xml:space="preserve">MEG regeneration.</w:t>
+      </w:r>
+      <w:r>
+        <w:t xml:space="preserve"> </w:t>
+      </w:r>
+      <w:r>
+        <w:t xml:space="preserve">Rich MEG is buffered in a tank, so the regeneration</w:t>
+      </w:r>
+      <w:r>
+        <w:t xml:space="preserve"> </w:t>
+      </w:r>
+      <w:r>
+        <w:t xml:space="preserve">unit (0.3 MW electric and 3 MW heat at full rate) may pause for up to 48 h</w:t>
+      </w:r>
+      <w:r>
+        <w:t xml:space="preserve"> </w:t>
+      </w:r>
+      <w:r>
+        <w:t xml:space="preserve">of full-rate feed and catch up later, exactly as water injection is</w:t>
+      </w:r>
+      <w:r>
+        <w:t xml:space="preserve"> </w:t>
+      </w:r>
+      <w:r>
+        <w:t xml:space="preserve">modelled for the North Sea platform. The MEG injection pumps are must-run.</w:t>
+      </w:r>
+    </w:p>
+    <w:p>
+      <w:pPr>
+        <w:pStyle w:val="FirstParagraph"/>
+      </w:pPr>
+      <w:r>
+        <w:t xml:space="preserve">The TEG and MEG heat duties follow the two levers, so the heat balance of</w:t>
+      </w:r>
+      <w:r>
+        <w:t xml:space="preserve"> </w:t>
+      </w:r>
+      <w:r>
+        <w:t xml:space="preserve">Section 6 changes with the schedule.</w:t>
+      </w:r>
+    </w:p>
+    <w:p>
+      <w:pPr>
+        <w:pStyle w:val="BodyText"/>
+      </w:pPr>
+      <w:r>
+        <w:rPr>
+          <w:bCs/>
+          <w:b/>
+        </w:rPr>
+        <w:t xml:space="preserve">Hot climate.</w:t>
+      </w:r>
+      <w:r>
+        <w:t xml:space="preserve"> </w:t>
+      </w:r>
+      <w:r>
+        <w:t xml:space="preserve">Gas turbine power and efficiency are derated for the ERA5</w:t>
+      </w:r>
+      <w:r>
+        <w:t xml:space="preserve"> </w:t>
+      </w:r>
+      <w:r>
+        <w:t xml:space="preserve">mean air temperature (26.8 °C, 11.8 K above ISO conditions) by 0.7 %/K and</w:t>
+      </w:r>
+      <w:r>
+        <w:t xml:space="preserve"> </w:t>
+      </w:r>
+      <w:r>
+        <w:t xml:space="preserve">0.1 %/K, rule-of-thumb values that should be replaced by a manufacturer’s</w:t>
+      </w:r>
+      <w:r>
+        <w:t xml:space="preserve"> </w:t>
+      </w:r>
+      <w:r>
+        <w:t xml:space="preserve">site rating. The LEOGO turbine then delivers 20.0 MW at 34.3 % efficiency.</w:t>
+      </w:r>
+      <w:r>
+        <w:t xml:space="preserve"> </w:t>
+      </w:r>
+      <w:r>
+        <w:t xml:space="preserve">Coolers use the ERA5 mean sea temperature (28.2 °C).</w:t>
+      </w:r>
+    </w:p>
+    <w:p>
+      <w:pPr>
+        <w:pStyle w:val="BodyText"/>
+      </w:pPr>
+      <w:r>
+        <w:rPr>
+          <w:bCs/>
+          <w:b/>
+        </w:rPr>
+        <w:t xml:space="preserve">Fuel and CO2 price.</w:t>
+      </w:r>
+      <w:r>
+        <w:t xml:space="preserve"> </w:t>
+      </w:r>
+      <w:r>
+        <w:t xml:space="preserve">The fuel is the lean export gas. Its lower heating</w:t>
+      </w:r>
+      <w:r>
+        <w:t xml:space="preserve"> </w:t>
+      </w:r>
+      <w:r>
+        <w:t xml:space="preserve">value (34.9 MJ/Sm³) is computed with NeqSim to ISO 6976, and its CO2 factor</w:t>
+      </w:r>
+      <w:r>
+        <w:t xml:space="preserve"> </w:t>
+      </w:r>
+      <w:r>
+        <w:t xml:space="preserve">(1.945 kg/Sm³) from its carbon content, instead of the Norwegian 2.34</w:t>
+      </w:r>
+      <w:r>
+        <w:t xml:space="preserve"> </w:t>
+      </w:r>
+      <w:r>
+        <w:t xml:space="preserve">kg/Sm³. Tanzania has no carbon tax or emission trading for upstream</w:t>
+      </w:r>
+      <w:r>
+        <w:t xml:space="preserve"> </w:t>
+      </w:r>
+      <w:r>
+        <w:t xml:space="preserve">petroleum, so the base CO2 price is zero; NOK 0.5–2/kg is tested as a</w:t>
+      </w:r>
+      <w:r>
+        <w:t xml:space="preserve"> </w:t>
+      </w:r>
+      <w:r>
+        <w:t xml:space="preserve">sensitivity, together with line-pack sizes of 0, 1.8, 3.6 and 7.2 h.</w:t>
+      </w:r>
+    </w:p>
+    <w:p>
+      <w:pPr>
+        <w:pStyle w:val="BodyText"/>
+      </w:pPr>
+      <w:r>
+        <w:rPr>
+          <w:bCs/>
+          <w:b/>
+        </w:rPr>
+        <w:t xml:space="preserve">Validation.</w:t>
+      </w:r>
+      <w:r>
+        <w:t xml:space="preserve"> </w:t>
+      </w:r>
+      <w:r>
+        <w:t xml:space="preserve">No published operating data exist for an offshore platform at</w:t>
+      </w:r>
+      <w:r>
+        <w:t xml:space="preserve"> </w:t>
+      </w:r>
+      <w:r>
+        <w:t xml:space="preserve">the site. The wind input is checked qualitatively against a study of</w:t>
+      </w:r>
+      <w:r>
+        <w:t xml:space="preserve"> </w:t>
+      </w:r>
+      <w:r>
+        <w:t xml:space="preserve">measured winds at coastal Tanzanian stations, which reports the strongest</w:t>
+      </w:r>
+      <w:r>
+        <w:t xml:space="preserve"> </w:t>
+      </w:r>
+      <w:r>
+        <w:t xml:space="preserve">winds at Mtwara and a June–July maximum with weak winds from November to</w:t>
+      </w:r>
+      <w:r>
+        <w:t xml:space="preserve"> </w:t>
+      </w:r>
+      <w:r>
+        <w:t xml:space="preserve">March, and against the ESMAP offshore-wind potential maps. Of the 115</w:t>
+      </w:r>
+      <w:r>
+        <w:t xml:space="preserve"> </w:t>
+      </w:r>
+      <w:r>
+        <w:t xml:space="preserve">parameters in the Tanzania configuration, 50 are still assumptions (Table</w:t>
+      </w:r>
+      <w:r>
+        <w:t xml:space="preserve"> </w:t>
+      </w:r>
+      <w:r>
+        <w:t xml:space="preserve">T1).</w:t>
+      </w:r>
+    </w:p>
+    <w:bookmarkEnd w:id="29"/>
+    <w:bookmarkStart w:id="32" w:name="references"/>
+    <w:p>
+      <w:pPr>
+        <w:pStyle w:val="Heading2"/>
+      </w:pPr>
+      <w:r>
+        <w:t xml:space="preserve">References</w:t>
+      </w:r>
+    </w:p>
+    <w:p>
+      <w:pPr>
+        <w:pStyle w:val="FirstParagraph"/>
+      </w:pPr>
+      <w:r>
+        <w:t xml:space="preserve">Gaertner, E. et al. (2020).</w:t>
+      </w:r>
+      <w:r>
         <w:t xml:space="preserve"> </w:t>
       </w:r>
       <w:r>
@@ -2952,34 +3419,34 @@
           <w:iCs/>
           <w:i/>
         </w:rPr>
-        <w:t xml:space="preserve">Reference Wind Turbine</w:t>
-      </w:r>
-      <w:r>
-        <w:t xml:space="preserve">. NREL/TP-5000-75698.</w:t>
-      </w:r>
-    </w:p>
-    <w:p>
-      <w:pPr>
-        <w:pStyle w:val="BodyText"/>
-      </w:pPr>
-      <w:r>
-        <w:t xml:space="preserve">Hersbach, H. et al. (2020). The ERA5 global reanalysis.</w:t>
-      </w:r>
-      <w:r>
-        <w:t xml:space="preserve"> </w:t>
+        <w:t xml:space="preserve">Definition of the IEA 15-Megawatt Offshore</w:t>
       </w:r>
       <w:r>
         <w:rPr>
           <w:iCs/>
           <w:i/>
         </w:rPr>
-        <w:t xml:space="preserve">Quarterly Journal of</w:t>
+        <w:t xml:space="preserve"> </w:t>
       </w:r>
       <w:r>
         <w:rPr>
           <w:iCs/>
           <w:i/>
         </w:rPr>
+        <w:t xml:space="preserve">Reference Wind Turbine</w:t>
+      </w:r>
+      <w:r>
+        <w:t xml:space="preserve">. NREL/TP-5000-75698.</w:t>
+      </w:r>
+    </w:p>
+    <w:p>
+      <w:pPr>
+        <w:pStyle w:val="BodyText"/>
+      </w:pPr>
+      <w:r>
+        <w:t xml:space="preserve">Hersbach, H. et al. (2020). The ERA5 global reanalysis.</w:t>
+      </w:r>
+      <w:r>
         <w:t xml:space="preserve"> </w:t>
       </w:r>
       <w:r>
@@ -2987,65 +3454,13 @@
           <w:iCs/>
           <w:i/>
         </w:rPr>
-        <w:t xml:space="preserve">the Royal Meteorological Society</w:t>
-      </w:r>
-      <w:r>
-        <w:t xml:space="preserve"> </w:t>
-      </w:r>
-      <w:r>
-        <w:t xml:space="preserve">146, 1999–2049.</w:t>
-      </w:r>
-    </w:p>
-    <w:p>
-      <w:pPr>
-        <w:pStyle w:val="BodyText"/>
-      </w:pPr>
-      <w:r>
-        <w:t xml:space="preserve">Hsu, S. A., Meindl, E. A. &amp; Gilhousen, D. B. (1994). Determining the</w:t>
-      </w:r>
-      <w:r>
-        <w:t xml:space="preserve"> </w:t>
-      </w:r>
-      <w:r>
-        <w:t xml:space="preserve">power-law wind-profile exponent under near-neutral stability conditions at</w:t>
-      </w:r>
-      <w:r>
-        <w:t xml:space="preserve"> </w:t>
-      </w:r>
-      <w:r>
-        <w:t xml:space="preserve">sea.</w:t>
-      </w:r>
-      <w:r>
-        <w:t xml:space="preserve"> </w:t>
+        <w:t xml:space="preserve">Quarterly Journal of</w:t>
       </w:r>
       <w:r>
         <w:rPr>
           <w:iCs/>
           <w:i/>
         </w:rPr>
-        <w:t xml:space="preserve">Journal of Applied Meteorology</w:t>
-      </w:r>
-      <w:r>
-        <w:t xml:space="preserve"> </w:t>
-      </w:r>
-      <w:r>
-        <w:t xml:space="preserve">33, 757–765.</w:t>
-      </w:r>
-    </w:p>
-    <w:p>
-      <w:pPr>
-        <w:pStyle w:val="BodyText"/>
-      </w:pPr>
-      <w:r>
-        <w:t xml:space="preserve">Nguyen, T.-V. et al. (2013). Exergetic assessment of energy systems on North</w:t>
-      </w:r>
-      <w:r>
-        <w:t xml:space="preserve"> </w:t>
-      </w:r>
-      <w:r>
-        <w:t xml:space="preserve">Sea oil and gas platforms.</w:t>
-      </w:r>
-      <w:r>
         <w:t xml:space="preserve"> </w:t>
       </w:r>
       <w:r>
@@ -3053,10 +3468,13 @@
           <w:iCs/>
           <w:i/>
         </w:rPr>
-        <w:t xml:space="preserve">Energy</w:t>
-      </w:r>
-      <w:r>
-        <w:t xml:space="preserve">.</w:t>
+        <w:t xml:space="preserve">the Royal Meteorological Society</w:t>
+      </w:r>
+      <w:r>
+        <w:t xml:space="preserve"> </w:t>
+      </w:r>
+      <w:r>
+        <w:t xml:space="preserve">146, 1999–2049.</w:t>
       </w:r>
     </w:p>
     <w:p>
@@ -3064,7 +3482,19 @@
         <w:pStyle w:val="BodyText"/>
       </w:pPr>
       <w:r>
-        <w:t xml:space="preserve">Offshore Norge (2024).</w:t>
+        <w:t xml:space="preserve">Hsu, S. A., Meindl, E. A. &amp; Gilhousen, D. B. (1994). Determining the</w:t>
+      </w:r>
+      <w:r>
+        <w:t xml:space="preserve"> </w:t>
+      </w:r>
+      <w:r>
+        <w:t xml:space="preserve">power-law wind-profile exponent under near-neutral stability conditions at</w:t>
+      </w:r>
+      <w:r>
+        <w:t xml:space="preserve"> </w:t>
+      </w:r>
+      <w:r>
+        <w:t xml:space="preserve">sea.</w:t>
       </w:r>
       <w:r>
         <w:t xml:space="preserve"> </w:t>
@@ -3074,10 +3504,13 @@
           <w:iCs/>
           <w:i/>
         </w:rPr>
-        <w:t xml:space="preserve">Climate and environmental report 2024</w:t>
-      </w:r>
-      <w:r>
-        <w:t xml:space="preserve">.</w:t>
+        <w:t xml:space="preserve">Journal of Applied Meteorology</w:t>
+      </w:r>
+      <w:r>
+        <w:t xml:space="preserve"> </w:t>
+      </w:r>
+      <w:r>
+        <w:t xml:space="preserve">33, 757–765.</w:t>
       </w:r>
     </w:p>
     <w:p>
@@ -3085,13 +3518,13 @@
         <w:pStyle w:val="BodyText"/>
       </w:pPr>
       <w:r>
-        <w:t xml:space="preserve">Sharqawy, M. H., Lienhard, J. H. &amp; Zubair, S. M. (2010). Thermophysical</w:t>
-      </w:r>
-      <w:r>
-        <w:t xml:space="preserve"> </w:t>
-      </w:r>
-      <w:r>
-        <w:t xml:space="preserve">properties of seawater.</w:t>
+        <w:t xml:space="preserve">Nguyen, T.-V. et al. (2013). Exergetic assessment of energy systems on North</w:t>
+      </w:r>
+      <w:r>
+        <w:t xml:space="preserve"> </w:t>
+      </w:r>
+      <w:r>
+        <w:t xml:space="preserve">Sea oil and gas platforms.</w:t>
       </w:r>
       <w:r>
         <w:t xml:space="preserve"> </w:t>
@@ -3101,13 +3534,10 @@
           <w:iCs/>
           <w:i/>
         </w:rPr>
-        <w:t xml:space="preserve">Desalination and Water Treatment</w:t>
-      </w:r>
-      <w:r>
-        <w:t xml:space="preserve"> </w:t>
-      </w:r>
-      <w:r>
-        <w:t xml:space="preserve">16, 354–380.</w:t>
+        <w:t xml:space="preserve">Energy</w:t>
+      </w:r>
+      <w:r>
+        <w:t xml:space="preserve">.</w:t>
       </w:r>
     </w:p>
     <w:p>
@@ -3115,13 +3545,7 @@
         <w:pStyle w:val="BodyText"/>
       </w:pPr>
       <w:r>
-        <w:t xml:space="preserve">Svendsen, H. G. et al. (2023). The Low Emission Oil and Gas Open reference</w:t>
-      </w:r>
-      <w:r>
-        <w:t xml:space="preserve"> </w:t>
-      </w:r>
-      <w:r>
-        <w:t xml:space="preserve">platform – an off-grid energy system for renewable integration studies.</w:t>
+        <w:t xml:space="preserve">Offshore Norge (2024).</w:t>
       </w:r>
       <w:r>
         <w:t xml:space="preserve"> </w:t>
@@ -3131,10 +3555,10 @@
           <w:iCs/>
           <w:i/>
         </w:rPr>
-        <w:t xml:space="preserve">IET Energy Systems Integration</w:t>
-      </w:r>
-      <w:r>
-        <w:t xml:space="preserve">. doi:10.1049/esi2.12085.</w:t>
+        <w:t xml:space="preserve">Climate and environmental report 2024</w:t>
+      </w:r>
+      <w:r>
+        <w:t xml:space="preserve">.</w:t>
       </w:r>
     </w:p>
     <w:p>
@@ -3142,19 +3566,13 @@
         <w:pStyle w:val="BodyText"/>
       </w:pPr>
       <w:r>
-        <w:t xml:space="preserve">Voldsund, M., Ertesvåg, I. S., He, W. &amp; Kjelstrup, S. (2013). Exergy analysis</w:t>
-      </w:r>
-      <w:r>
-        <w:t xml:space="preserve"> </w:t>
-      </w:r>
-      <w:r>
-        <w:t xml:space="preserve">of the oil and gas processing on a North Sea oil platform a real production</w:t>
-      </w:r>
-      <w:r>
-        <w:t xml:space="preserve"> </w:t>
-      </w:r>
-      <w:r>
-        <w:t xml:space="preserve">day.</w:t>
+        <w:t xml:space="preserve">Sharqawy, M. H., Lienhard, J. H. &amp; Zubair, S. M. (2010). Thermophysical</w:t>
+      </w:r>
+      <w:r>
+        <w:t xml:space="preserve"> </w:t>
+      </w:r>
+      <w:r>
+        <w:t xml:space="preserve">properties of seawater.</w:t>
       </w:r>
       <w:r>
         <w:t xml:space="preserve"> </w:t>
@@ -3164,6 +3582,69 @@
           <w:iCs/>
           <w:i/>
         </w:rPr>
+        <w:t xml:space="preserve">Desalination and Water Treatment</w:t>
+      </w:r>
+      <w:r>
+        <w:t xml:space="preserve"> </w:t>
+      </w:r>
+      <w:r>
+        <w:t xml:space="preserve">16, 354–380.</w:t>
+      </w:r>
+    </w:p>
+    <w:p>
+      <w:pPr>
+        <w:pStyle w:val="BodyText"/>
+      </w:pPr>
+      <w:r>
+        <w:t xml:space="preserve">Svendsen, H. G. et al. (2023). The Low Emission Oil and Gas Open reference</w:t>
+      </w:r>
+      <w:r>
+        <w:t xml:space="preserve"> </w:t>
+      </w:r>
+      <w:r>
+        <w:t xml:space="preserve">platform – an off-grid energy system for renewable integration studies.</w:t>
+      </w:r>
+      <w:r>
+        <w:t xml:space="preserve"> </w:t>
+      </w:r>
+      <w:r>
+        <w:rPr>
+          <w:iCs/>
+          <w:i/>
+        </w:rPr>
+        <w:t xml:space="preserve">IET Energy Systems Integration</w:t>
+      </w:r>
+      <w:r>
+        <w:t xml:space="preserve">. doi:10.1049/esi2.12085.</w:t>
+      </w:r>
+    </w:p>
+    <w:p>
+      <w:pPr>
+        <w:pStyle w:val="BodyText"/>
+      </w:pPr>
+      <w:r>
+        <w:t xml:space="preserve">Voldsund, M., Ertesvåg, I. S., He, W. &amp; Kjelstrup, S. (2013). Exergy analysis</w:t>
+      </w:r>
+      <w:r>
+        <w:t xml:space="preserve"> </w:t>
+      </w:r>
+      <w:r>
+        <w:t xml:space="preserve">of the oil and gas processing on a North Sea oil platform a real production</w:t>
+      </w:r>
+      <w:r>
+        <w:t xml:space="preserve"> </w:t>
+      </w:r>
+      <w:r>
+        <w:t xml:space="preserve">day.</w:t>
+      </w:r>
+      <w:r>
+        <w:t xml:space="preserve"> </w:t>
+      </w:r>
+      <w:r>
+        <w:rPr>
+          <w:iCs/>
+          <w:i/>
+        </w:rPr>
         <w:t xml:space="preserve">Energy</w:t>
       </w:r>
       <w:r>
@@ -3185,6 +3666,85 @@
       </w:r>
       <w:r>
         <w:t xml:space="preserve">the Norwegian continental shelf.</w:t>
+      </w:r>
+    </w:p>
+    <w:p>
+      <w:pPr>
+        <w:pStyle w:val="BodyText"/>
+      </w:pPr>
+      <w:r>
+        <w:t xml:space="preserve">ESMAP (2020).</w:t>
+      </w:r>
+      <w:r>
+        <w:t xml:space="preserve"> </w:t>
+      </w:r>
+      <w:r>
+        <w:rPr>
+          <w:iCs/>
+          <w:i/>
+        </w:rPr>
+        <w:t xml:space="preserve">Offshore Wind Technical Potential: Analysis and Maps</w:t>
+      </w:r>
+      <w:r>
+        <w:t xml:space="preserve">. World</w:t>
+      </w:r>
+      <w:r>
+        <w:t xml:space="preserve"> </w:t>
+      </w:r>
+      <w:r>
+        <w:t xml:space="preserve">Bank Energy Sector Management Assistance Program.</w:t>
+      </w:r>
+      <w:r>
+        <w:t xml:space="preserve"> </w:t>
+      </w:r>
+      <w:hyperlink r:id="rId30">
+        <w:r>
+          <w:rPr>
+            <w:rStyle w:val="Hyperlink"/>
+          </w:rPr>
+          <w:t xml:space="preserve">https://www.esmap.org/esmap_offshorewind_techpotential_analysis_maps</w:t>
+        </w:r>
+      </w:hyperlink>
+    </w:p>
+    <w:p>
+      <w:pPr>
+        <w:pStyle w:val="BodyText"/>
+      </w:pPr>
+      <w:r>
+        <w:rPr>
+          <w:iCs/>
+          <w:i/>
+        </w:rPr>
+        <w:t xml:space="preserve">Wind patterns of coastal Tanzania</w:t>
+      </w:r>
+      <w:r>
+        <w:t xml:space="preserve"> </w:t>
+      </w:r>
+      <w:r>
+        <w:t xml:space="preserve">(University of Dar es Salaam</w:t>
+      </w:r>
+      <w:r>
+        <w:t xml:space="preserve"> </w:t>
+      </w:r>
+      <w:r>
+        <w:t xml:space="preserve">repository).</w:t>
+      </w:r>
+      <w:r>
+        <w:t xml:space="preserve"> </w:t>
+      </w:r>
+      <w:hyperlink r:id="rId31">
+        <w:r>
+          <w:rPr>
+            <w:rStyle w:val="Hyperlink"/>
+          </w:rPr>
+          <w:t xml:space="preserve">https://repository.udsm.ac.tz/items/2f0fb49f-1275-4710-b7f1-116e2bdf0264</w:t>
+        </w:r>
+      </w:hyperlink>
+      <w:r>
+        <w:t xml:space="preserve"> </w:t>
+      </w:r>
+      <w:r>
+        <w:t xml:space="preserve">(authors and year to be completed from the original).</w:t>
       </w:r>
     </w:p>
     <w:p>
@@ -3304,8 +3864,8 @@
         <w:t xml:space="preserve">should be confirmed against the original documents.</w:t>
       </w:r>
     </w:p>
-    <w:bookmarkEnd w:id="29"/>
-    <w:bookmarkEnd w:id="30"/>
+    <w:bookmarkEnd w:id="32"/>
+    <w:bookmarkEnd w:id="33"/>
     <w:sectPr/>
   </w:body>
 </w:document>
@@ -3619,6 +4179,9 @@
     <w:abstractNumId w:val="991"/>
   </w:num>
   <w:num w:numId="1006">
+    <w:abstractNumId w:val="991"/>
+  </w:num>
+  <w:num w:numId="1007">
     <w:abstractNumId w:val="991"/>
   </w:num>
 </w:numbering>

</xml_diff>

<commit_message>
Check sources in Voldsund 2013/2014 and Nguyen 2013; drop Tanzania from the paper
Sources (checked in the original papers):
- Separator pressures now 70/29/7.2/1.8 bara from Nguyen et al. (2013) Table 1
  (was 70/29.2/7.9/1.8 attributed to Voldsund); design power changes < 0.01 %
- Voldsund power benchmark corrected to 17-30 MW processing-plant power of three
  real oil platforms (Voldsund et al. 2014, Table 5); was 18-26 MW
- Gas export 180 bara confirmed (179 bar, Voldsund 2014 Table 2)
- Full references and DOIs; Voldsund 2013 DOI corrected to 10.1016/j.energy.2013.02.038

Paper:
- Methods Section 10, the Tanzania summary point and the Section 9 build step
  removed; comparison draft archived in docs/tanzania/. Tanzania code, config
  and results stay in the repository.
</commit_message>
<xml_diff>
--- a/docs/thesis/methods.docx
+++ b/docs/thesis/methods.docx
@@ -2,7 +2,7 @@
 <file path=word/document.xml><?xml version="1.0" encoding="utf-8"?>
 <w:document xmlns:w="http://schemas.openxmlformats.org/wordprocessingml/2006/main" xmlns:m="http://schemas.openxmlformats.org/officeDocument/2006/math" xmlns:r="http://schemas.openxmlformats.org/officeDocument/2006/relationships" xmlns:o="urn:schemas-microsoft-com:office:office" xmlns:v="urn:schemas-microsoft-com:vml" xmlns:w10="urn:schemas-microsoft-com:office:word" xmlns:a="http://schemas.openxmlformats.org/drawingml/2006/main" xmlns:pic="http://schemas.openxmlformats.org/drawingml/2006/picture" xmlns:wp="http://schemas.openxmlformats.org/drawingml/2006/wordprocessingDrawing">
   <w:body>
-    <w:bookmarkStart w:id="33" w:name="methods"/>
+    <w:bookmarkStart w:id="30" w:name="methods"/>
     <w:p>
       <w:pPr>
         <w:pStyle w:val="Heading1"/>
@@ -1118,13 +1118,19 @@
         <w:pStyle w:val="Compact"/>
       </w:pPr>
       <w:r>
-        <w:t xml:space="preserve">four-stage separation at 70 / 29.2 / 7.9 / 1.8 bara (Voldsund et al., 2013,</w:t>
-      </w:r>
-      <w:r>
-        <w:t xml:space="preserve"> </w:t>
-      </w:r>
-      <w:r>
-        <w:t xml:space="preserve">and related North Sea platform studies);</w:t>
+        <w:t xml:space="preserve">four-stage separation at 70 / 29 / 7.2 / 1.8 bara (Nguyen et al., 2013;</w:t>
+      </w:r>
+      <w:r>
+        <w:t xml:space="preserve"> </w:t>
+      </w:r>
+      <w:r>
+        <w:t xml:space="preserve">the last stage lies within the 1.7–2.8 bar found on four real North Sea</w:t>
+      </w:r>
+      <w:r>
+        <w:t xml:space="preserve"> </w:t>
+      </w:r>
+      <w:r>
+        <w:t xml:space="preserve">platforms by Voldsund et al., 2014);</w:t>
       </w:r>
     </w:p>
     <w:p>
@@ -2632,13 +2638,19 @@
         <w:t xml:space="preserve"> </w:t>
       </w:r>
       <w:r>
-        <w:t xml:space="preserve">against measured and modelled North Sea platforms</w:t>
-      </w:r>
-      <w:r>
-        <w:t xml:space="preserve"> </w:t>
-      </w:r>
-      <w:r>
-        <w:t xml:space="preserve">(Voldsund et al., 2013; Nguyen et al., 2013), the Johan Castberg plan for</w:t>
+        <w:t xml:space="preserve">against the processing-plant power of three real</w:t>
+      </w:r>
+      <w:r>
+        <w:t xml:space="preserve"> </w:t>
+      </w:r>
+      <w:r>
+        <w:t xml:space="preserve">North Sea oil platforms (Voldsund et al., 2013, 2014) and six modelled</w:t>
+      </w:r>
+      <w:r>
+        <w:t xml:space="preserve"> </w:t>
+      </w:r>
+      <w:r>
+        <w:t xml:space="preserve">platforms (Nguyen et al., 2013), the Johan Castberg plan for</w:t>
       </w:r>
       <w:r>
         <w:t xml:space="preserve"> </w:t>
@@ -2914,13 +2926,13 @@
       </w:r>
     </w:p>
     <w:bookmarkEnd w:id="28"/>
-    <w:bookmarkStart w:id="29" w:name="Xd90a2aa44459819cf19b462991e82ce0bd4a26d"/>
+    <w:bookmarkStart w:id="29" w:name="references"/>
     <w:p>
       <w:pPr>
         <w:pStyle w:val="Heading2"/>
       </w:pPr>
       <w:r>
-        <w:t xml:space="preserve">10 Comparison site: deepwater gas off southern Tanzania</w:t>
+        <w:t xml:space="preserve">References</w:t>
       </w:r>
     </w:p>
     <w:p>
@@ -2928,559 +2940,23 @@
         <w:pStyle w:val="FirstParagraph"/>
       </w:pPr>
       <w:r>
-        <w:t xml:space="preserve">To test whether the result depends on the North Sea setting, the same model</w:t>
-      </w:r>
-      <w:r>
-        <w:t xml:space="preserve"> </w:t>
-      </w:r>
-      <w:r>
-        <w:t xml:space="preserve">is applied to a second, contrasting site. Only what differs is set in a</w:t>
-      </w:r>
-      <w:r>
-        <w:t xml:space="preserve"> </w:t>
-      </w:r>
-      <w:r>
-        <w:t xml:space="preserve">separate configuration (</w:t>
-      </w:r>
-      <w:r>
-        <w:rPr>
-          <w:rStyle w:val="VerbatimChar"/>
-        </w:rPr>
-        <w:t xml:space="preserve">config/tanzania.yaml</w:t>
-      </w:r>
-      <w:r>
-        <w:t xml:space="preserve">), which inherits every other</w:t>
-      </w:r>
-      <w:r>
-        <w:t xml:space="preserve"> </w:t>
-      </w:r>
-      <w:r>
-        <w:t xml:space="preserve">parameter from the base case; the same code, wind turbine, gas turbines,</w:t>
-      </w:r>
-      <w:r>
-        <w:t xml:space="preserve"> </w:t>
-      </w:r>
-      <w:r>
-        <w:t xml:space="preserve">scheduler and cases are used.</w:t>
-      </w:r>
-    </w:p>
-    <w:p>
-      <w:pPr>
-        <w:pStyle w:val="BodyText"/>
-      </w:pPr>
-      <w:r>
-        <w:rPr>
-          <w:bCs/>
-          <w:b/>
-        </w:rPr>
-        <w:t xml:space="preserve">Site and weather.</w:t>
-      </w:r>
-      <w:r>
-        <w:t xml:space="preserve"> </w:t>
-      </w:r>
-      <w:r>
-        <w:t xml:space="preserve">The site is the deepwater gas discoveries in Blocks 1,</w:t>
-      </w:r>
-      <w:r>
-        <w:t xml:space="preserve"> </w:t>
-      </w:r>
-      <w:r>
-        <w:t xml:space="preserve">2 and 4 off Lindi and Mtwara (9.5° S, 40.5° E, water depth 1000–3000 m), the</w:t>
-      </w:r>
-      <w:r>
-        <w:t xml:space="preserve"> </w:t>
-      </w:r>
-      <w:r>
-        <w:t xml:space="preserve">resource behind the planned Tanzania LNG project. Wind, 2 m air temperature</w:t>
-      </w:r>
-      <w:r>
-        <w:t xml:space="preserve"> </w:t>
-      </w:r>
-      <w:r>
-        <w:t xml:space="preserve">and sea-surface temperature for 2023 come from ERA5, processed as in Section</w:t>
-      </w:r>
-      <w:r>
-        <w:t xml:space="preserve"> </w:t>
-      </w:r>
-      <w:r>
-        <w:t xml:space="preserve">2. The two IEA 15 MW turbines are assumed to sit on floating foundations, as</w:t>
-      </w:r>
-      <w:r>
-        <w:t xml:space="preserve"> </w:t>
-      </w:r>
-      <w:r>
-        <w:t xml:space="preserve">at Hywind Tampen; the power curve is unchanged.</w:t>
-      </w:r>
-    </w:p>
-    <w:p>
-      <w:pPr>
-        <w:pStyle w:val="BodyText"/>
-      </w:pPr>
-      <w:r>
-        <w:rPr>
-          <w:bCs/>
-          <w:b/>
-        </w:rPr>
-        <w:t xml:space="preserve">Platform and process.</w:t>
-      </w:r>
-      <w:r>
-        <w:t xml:space="preserve"> </w:t>
-      </w:r>
-      <w:r>
-        <w:t xml:space="preserve">The platform is a hypothetical gas processing</w:t>
-      </w:r>
-      <w:r>
-        <w:t xml:space="preserve"> </w:t>
-      </w:r>
-      <w:r>
-        <w:t xml:space="preserve">platform that sends 10 MSm³/d of dry gas (about a quarter of a two-train</w:t>
-      </w:r>
-      <w:r>
-        <w:t xml:space="preserve"> </w:t>
-      </w:r>
-      <w:r>
-        <w:t xml:space="preserve">LNG plant) through a 100 km, 0.6 m pipeline to shore. The real development</w:t>
-      </w:r>
-      <w:r>
-        <w:t xml:space="preserve"> </w:t>
-      </w:r>
-      <w:r>
-        <w:t xml:space="preserve">concept is subsea wells tied back to an onshore plant, so the platform is a</w:t>
-      </w:r>
-      <w:r>
-        <w:t xml:space="preserve"> </w:t>
-      </w:r>
-      <w:r>
-        <w:t xml:space="preserve">modelling device that makes the two sites comparable, not a description of</w:t>
-      </w:r>
-      <w:r>
-        <w:t xml:space="preserve"> </w:t>
-      </w:r>
-      <w:r>
-        <w:t xml:space="preserve">the project. A lean gas (95.5 mol % methane) arrives at 70 bara and 15 °C.</w:t>
-      </w:r>
-      <w:r>
-        <w:t xml:space="preserve"> </w:t>
-      </w:r>
-      <w:r>
-        <w:t xml:space="preserve">NeqSim (Peng–Robinson) models the inlet separation, condensate</w:t>
-      </w:r>
-      <w:r>
-        <w:t xml:space="preserve"> </w:t>
-      </w:r>
-      <w:r>
-        <w:t xml:space="preserve">stabilisation at 10 bara, and compression of the gas to 150 bara for</w:t>
-      </w:r>
-      <w:r>
-        <w:t xml:space="preserve"> </w:t>
-      </w:r>
-      <w:r>
-        <w:t xml:space="preserve">export, with the same isentropic efficiency as the North Sea compressors.</w:t>
-      </w:r>
-      <w:r>
-        <w:t xml:space="preserve"> </w:t>
-      </w:r>
-      <w:r>
-        <w:t xml:space="preserve">Gas dehydration with triethylene glycol (TEG) and regeneration of the</w:t>
-      </w:r>
-      <w:r>
-        <w:t xml:space="preserve"> </w:t>
-      </w:r>
-      <w:r>
-        <w:t xml:space="preserve">mono-ethylene glycol (MEG) injected into the subsea wells for hydrate</w:t>
-      </w:r>
-      <w:r>
-        <w:t xml:space="preserve"> </w:t>
-      </w:r>
-      <w:r>
-        <w:t xml:space="preserve">control are represented by their heat and electric duties (Table T1). These</w:t>
-      </w:r>
-      <w:r>
-        <w:t xml:space="preserve"> </w:t>
-      </w:r>
-      <w:r>
-        <w:t xml:space="preserve">duties were checked against NeqSim water contents of the gas. Drying</w:t>
-      </w:r>
-      <w:r>
-        <w:t xml:space="preserve"> </w:t>
-      </w:r>
-      <w:r>
-        <w:t xml:space="preserve">10 MSm³/d needs a TEG reboiler of about 0.5 MW. Regenerating the MEG that</w:t>
-      </w:r>
-      <w:r>
-        <w:t xml:space="preserve"> </w:t>
-      </w:r>
-      <w:r>
-        <w:t xml:space="preserve">carries the water condensed between reservoir and platform needs about 1 MW</w:t>
-      </w:r>
-      <w:r>
-        <w:t xml:space="preserve"> </w:t>
-      </w:r>
-      <w:r>
-        <w:t xml:space="preserve">of heat, for an assumed reservoir of 80 °C and 300 bara. The MEG injection</w:t>
-      </w:r>
-      <w:r>
-        <w:t xml:space="preserve"> </w:t>
-      </w:r>
-      <w:r>
-        <w:t xml:space="preserve">pumps need only about 0.05 MW (</w:t>
-      </w:r>
-      <w:r>
-        <w:rPr>
-          <w:rStyle w:val="VerbatimChar"/>
-        </w:rPr>
-        <w:t xml:space="preserve">docs/verification/tanzania_process_check.py</w:t>
-      </w:r>
-      <w:r>
-        <w:t xml:space="preserve">).</w:t>
-      </w:r>
-      <w:r>
-        <w:t xml:space="preserve"> </w:t>
-      </w:r>
-      <w:r>
-        <w:t xml:space="preserve">The design electric demand is 15.4 MW, of which export compression is</w:t>
-      </w:r>
-      <w:r>
-        <w:t xml:space="preserve"> </w:t>
-      </w:r>
-      <w:r>
-        <w:t xml:space="preserve">11.2 MW (73 %).</w:t>
-      </w:r>
-    </w:p>
-    <w:p>
-      <w:pPr>
-        <w:pStyle w:val="BodyText"/>
-      </w:pPr>
-      <w:r>
-        <w:rPr>
-          <w:bCs/>
-          <w:b/>
-        </w:rPr>
-        <w:t xml:space="preserve">Flexibility levers.</w:t>
-      </w:r>
-      <w:r>
-        <w:t xml:space="preserve"> </w:t>
-      </w:r>
-      <w:r>
-        <w:t xml:space="preserve">A gas platform has no water injection, so the two</w:t>
-      </w:r>
-      <w:r>
-        <w:t xml:space="preserve"> </w:t>
-      </w:r>
-      <w:r>
-        <w:t xml:space="preserve">levers are different:</w:t>
-      </w:r>
-    </w:p>
-    <w:p>
-      <w:pPr>
-        <w:numPr>
-          <w:ilvl w:val="0"/>
-          <w:numId w:val="1007"/>
-        </w:numPr>
-        <w:pStyle w:val="Compact"/>
-      </w:pPr>
+        <w:t xml:space="preserve">Gaertner, E. et al. (2020).</w:t>
+      </w:r>
+      <w:r>
+        <w:t xml:space="preserve"> </w:t>
+      </w:r>
       <w:r>
         <w:rPr>
           <w:iCs/>
           <w:i/>
         </w:rPr>
-        <w:t xml:space="preserve">Gas production and line pack.</w:t>
-      </w:r>
-      <w:r>
-        <w:t xml:space="preserve"> </w:t>
-      </w:r>
-      <w:r>
-        <w:t xml:space="preserve">The export pipeline stores gas. Allowing</w:t>
-      </w:r>
-      <w:r>
-        <w:t xml:space="preserve"> </w:t>
-      </w:r>
-      <w:r>
-        <w:t xml:space="preserve">its inlet pressure to swing between 150 and 110 bara stores</w:t>
-      </w:r>
-      <w:r>
-        <w:t xml:space="preserve"> </w:t>
-      </w:r>
-      <w:r>
-        <w:t xml:space="preserve">3.6 h of full-rate production, computed from NeqSim gas densities at the</w:t>
-      </w:r>
-      <w:r>
-        <w:t xml:space="preserve"> </w:t>
-      </w:r>
-      <w:r>
-        <w:t xml:space="preserve">two pressures and the pipeline volume. The platform may produce between</w:t>
-      </w:r>
-      <w:r>
-        <w:t xml:space="preserve"> </w:t>
-      </w:r>
-      <w:r>
-        <w:t xml:space="preserve">50 % and 110 % of the sales rate, as long as the deficit against the sales</w:t>
-      </w:r>
-      <w:r>
-        <w:t xml:space="preserve"> </w:t>
-      </w:r>
-      <w:r>
-        <w:t xml:space="preserve">rate never exceeds the line pack and is repaid by the end of the horizon.</w:t>
-      </w:r>
-      <w:r>
-        <w:t xml:space="preserve"> </w:t>
-      </w:r>
-      <w:r>
-        <w:t xml:space="preserve">Delivered gas, and therefore the LNG plant, is unaffected on average; no</w:t>
-      </w:r>
-      <w:r>
-        <w:t xml:space="preserve"> </w:t>
-      </w:r>
-      <w:r>
-        <w:t xml:space="preserve">production is lost.</w:t>
-      </w:r>
-    </w:p>
-    <w:p>
-      <w:pPr>
-        <w:numPr>
-          <w:ilvl w:val="0"/>
-          <w:numId w:val="1007"/>
-        </w:numPr>
-        <w:pStyle w:val="Compact"/>
-      </w:pPr>
+        <w:t xml:space="preserve">Definition of the IEA 15-Megawatt Offshore</w:t>
+      </w:r>
       <w:r>
         <w:rPr>
           <w:iCs/>
           <w:i/>
         </w:rPr>
-        <w:t xml:space="preserve">MEG regeneration.</w:t>
-      </w:r>
-      <w:r>
-        <w:t xml:space="preserve"> </w:t>
-      </w:r>
-      <w:r>
-        <w:t xml:space="preserve">Rich MEG is buffered in a tank, so the regeneration</w:t>
-      </w:r>
-      <w:r>
-        <w:t xml:space="preserve"> </w:t>
-      </w:r>
-      <w:r>
-        <w:t xml:space="preserve">unit (0.1 MW electric and 1 MW heat at full rate) may pause for up to 48 h</w:t>
-      </w:r>
-      <w:r>
-        <w:t xml:space="preserve"> </w:t>
-      </w:r>
-      <w:r>
-        <w:t xml:space="preserve">of full-rate feed and catch up later, exactly as water injection is</w:t>
-      </w:r>
-      <w:r>
-        <w:t xml:space="preserve"> </w:t>
-      </w:r>
-      <w:r>
-        <w:t xml:space="preserve">modelled for the North Sea platform. The MEG injection pumps are must-run.</w:t>
-      </w:r>
-    </w:p>
-    <w:p>
-      <w:pPr>
-        <w:pStyle w:val="FirstParagraph"/>
-      </w:pPr>
-      <w:r>
-        <w:t xml:space="preserve">The TEG and MEG heat duties follow the two levers, so the heat balance of</w:t>
-      </w:r>
-      <w:r>
-        <w:t xml:space="preserve"> </w:t>
-      </w:r>
-      <w:r>
-        <w:t xml:space="preserve">Section 6 changes with the schedule.</w:t>
-      </w:r>
-    </w:p>
-    <w:p>
-      <w:pPr>
-        <w:pStyle w:val="BodyText"/>
-      </w:pPr>
-      <w:r>
-        <w:rPr>
-          <w:bCs/>
-          <w:b/>
-        </w:rPr>
-        <w:t xml:space="preserve">Hot climate.</w:t>
-      </w:r>
-      <w:r>
-        <w:t xml:space="preserve"> </w:t>
-      </w:r>
-      <w:r>
-        <w:t xml:space="preserve">Gas turbine power and efficiency are derated for the ERA5</w:t>
-      </w:r>
-      <w:r>
-        <w:t xml:space="preserve"> </w:t>
-      </w:r>
-      <w:r>
-        <w:t xml:space="preserve">mean air temperature (26.8 °C, 11.8 K above ISO conditions) by 0.7 %/K and</w:t>
-      </w:r>
-      <w:r>
-        <w:t xml:space="preserve"> </w:t>
-      </w:r>
-      <w:r>
-        <w:t xml:space="preserve">0.1 %/K, rule-of-thumb values that should be replaced by a manufacturer’s</w:t>
-      </w:r>
-      <w:r>
-        <w:t xml:space="preserve"> </w:t>
-      </w:r>
-      <w:r>
-        <w:t xml:space="preserve">site rating. The LEOGO turbine then delivers 20.0 MW at 34.3 % efficiency.</w:t>
-      </w:r>
-      <w:r>
-        <w:t xml:space="preserve"> </w:t>
-      </w:r>
-      <w:r>
-        <w:t xml:space="preserve">Coolers use the ERA5 mean sea temperature (28.2 °C).</w:t>
-      </w:r>
-    </w:p>
-    <w:p>
-      <w:pPr>
-        <w:pStyle w:val="BodyText"/>
-      </w:pPr>
-      <w:r>
-        <w:rPr>
-          <w:bCs/>
-          <w:b/>
-        </w:rPr>
-        <w:t xml:space="preserve">Fuel and CO2 price.</w:t>
-      </w:r>
-      <w:r>
-        <w:t xml:space="preserve"> </w:t>
-      </w:r>
-      <w:r>
-        <w:t xml:space="preserve">The fuel is the lean export gas. Its lower heating</w:t>
-      </w:r>
-      <w:r>
-        <w:t xml:space="preserve"> </w:t>
-      </w:r>
-      <w:r>
-        <w:t xml:space="preserve">value (34.9 MJ/Sm³) is computed with NeqSim to ISO 6976, and its CO2 factor</w:t>
-      </w:r>
-      <w:r>
-        <w:t xml:space="preserve"> </w:t>
-      </w:r>
-      <w:r>
-        <w:t xml:space="preserve">(1.945 kg/Sm³) from its carbon content, instead of the Norwegian 2.34</w:t>
-      </w:r>
-      <w:r>
-        <w:t xml:space="preserve"> </w:t>
-      </w:r>
-      <w:r>
-        <w:t xml:space="preserve">kg/Sm³. The base CO2 price is the excise duty introduced by the Tanzanian</w:t>
-      </w:r>
-      <w:r>
-        <w:t xml:space="preserve"> </w:t>
-      </w:r>
-      <w:r>
-        <w:t xml:space="preserve">Finance Act 2025: TZS 22,000 per tonne of carbon emissions from coal and</w:t>
-      </w:r>
-      <w:r>
-        <w:t xml:space="preserve"> </w:t>
-      </w:r>
-      <w:r>
-        <w:t xml:space="preserve">natural gas, about NOK 0.09/kg at 10.5 NOK/USD. Whether it applies to fuel</w:t>
-      </w:r>
-      <w:r>
-        <w:t xml:space="preserve"> </w:t>
-      </w:r>
-      <w:r>
-        <w:t xml:space="preserve">gas burnt offshore is not confirmed. CO2 prices of 0–2 NOK/kg are therefore</w:t>
-      </w:r>
-      <w:r>
-        <w:t xml:space="preserve"> </w:t>
-      </w:r>
-      <w:r>
-        <w:t xml:space="preserve">tested as a sensitivity, together with line-pack sizes of 0, 1.8, 3.6 and</w:t>
-      </w:r>
-      <w:r>
-        <w:t xml:space="preserve"> </w:t>
-      </w:r>
-      <w:r>
-        <w:t xml:space="preserve">7.2 h.</w:t>
-      </w:r>
-    </w:p>
-    <w:p>
-      <w:pPr>
-        <w:pStyle w:val="BodyText"/>
-      </w:pPr>
-      <w:r>
-        <w:rPr>
-          <w:bCs/>
-          <w:b/>
-        </w:rPr>
-        <w:t xml:space="preserve">Validation.</w:t>
-      </w:r>
-      <w:r>
-        <w:t xml:space="preserve"> </w:t>
-      </w:r>
-      <w:r>
-        <w:t xml:space="preserve">No published operating data exist for an offshore platform at</w:t>
-      </w:r>
-      <w:r>
-        <w:t xml:space="preserve"> </w:t>
-      </w:r>
-      <w:r>
-        <w:t xml:space="preserve">the site. The wind input is checked qualitatively against a study of</w:t>
-      </w:r>
-      <w:r>
-        <w:t xml:space="preserve"> </w:t>
-      </w:r>
-      <w:r>
-        <w:t xml:space="preserve">measured winds at coastal Tanzanian stations, which reports the strongest</w:t>
-      </w:r>
-      <w:r>
-        <w:t xml:space="preserve"> </w:t>
-      </w:r>
-      <w:r>
-        <w:t xml:space="preserve">winds at Mtwara and a June–July maximum with weak winds from November to</w:t>
-      </w:r>
-      <w:r>
-        <w:t xml:space="preserve"> </w:t>
-      </w:r>
-      <w:r>
-        <w:t xml:space="preserve">March, and against the ESMAP offshore-wind potential maps. Of the 115</w:t>
-      </w:r>
-      <w:r>
-        <w:t xml:space="preserve"> </w:t>
-      </w:r>
-      <w:r>
-        <w:t xml:space="preserve">parameters in the Tanzania configuration, 43 are still assumptions, 22 of</w:t>
-      </w:r>
-      <w:r>
-        <w:t xml:space="preserve"> </w:t>
-      </w:r>
-      <w:r>
-        <w:t xml:space="preserve">them specific to Tanzania (Table T1;</w:t>
-      </w:r>
-      <w:r>
-        <w:t xml:space="preserve"> </w:t>
-      </w:r>
-      <w:r>
-        <w:rPr>
-          <w:rStyle w:val="VerbatimChar"/>
-        </w:rPr>
-        <w:t xml:space="preserve">docs/verification/tanzania_assumptions.md</w:t>
-      </w:r>
-      <w:r>
-        <w:t xml:space="preserve">).</w:t>
-      </w:r>
-    </w:p>
-    <w:bookmarkEnd w:id="29"/>
-    <w:bookmarkStart w:id="32" w:name="references"/>
-    <w:p>
-      <w:pPr>
-        <w:pStyle w:val="Heading2"/>
-      </w:pPr>
-      <w:r>
-        <w:t xml:space="preserve">References</w:t>
-      </w:r>
-    </w:p>
-    <w:p>
-      <w:pPr>
-        <w:pStyle w:val="FirstParagraph"/>
-      </w:pPr>
-      <w:r>
-        <w:t xml:space="preserve">Gaertner, E. et al. (2020).</w:t>
-      </w:r>
-      <w:r>
         <w:t xml:space="preserve"> </w:t>
       </w:r>
       <w:r>
@@ -3488,34 +2964,34 @@
           <w:iCs/>
           <w:i/>
         </w:rPr>
-        <w:t xml:space="preserve">Definition of the IEA 15-Megawatt Offshore</w:t>
+        <w:t xml:space="preserve">Reference Wind Turbine</w:t>
+      </w:r>
+      <w:r>
+        <w:t xml:space="preserve">. NREL/TP-5000-75698.</w:t>
+      </w:r>
+    </w:p>
+    <w:p>
+      <w:pPr>
+        <w:pStyle w:val="BodyText"/>
+      </w:pPr>
+      <w:r>
+        <w:t xml:space="preserve">Hersbach, H. et al. (2020). The ERA5 global reanalysis.</w:t>
+      </w:r>
+      <w:r>
+        <w:t xml:space="preserve"> </w:t>
       </w:r>
       <w:r>
         <w:rPr>
           <w:iCs/>
           <w:i/>
         </w:rPr>
-        <w:t xml:space="preserve"> </w:t>
+        <w:t xml:space="preserve">Quarterly Journal of</w:t>
       </w:r>
       <w:r>
         <w:rPr>
           <w:iCs/>
           <w:i/>
         </w:rPr>
-        <w:t xml:space="preserve">Reference Wind Turbine</w:t>
-      </w:r>
-      <w:r>
-        <w:t xml:space="preserve">. NREL/TP-5000-75698.</w:t>
-      </w:r>
-    </w:p>
-    <w:p>
-      <w:pPr>
-        <w:pStyle w:val="BodyText"/>
-      </w:pPr>
-      <w:r>
-        <w:t xml:space="preserve">Hersbach, H. et al. (2020). The ERA5 global reanalysis.</w:t>
-      </w:r>
-      <w:r>
         <w:t xml:space="preserve"> </w:t>
       </w:r>
       <w:r>
@@ -3523,13 +2999,71 @@
           <w:iCs/>
           <w:i/>
         </w:rPr>
-        <w:t xml:space="preserve">Quarterly Journal of</w:t>
+        <w:t xml:space="preserve">the Royal Meteorological Society</w:t>
+      </w:r>
+      <w:r>
+        <w:t xml:space="preserve"> </w:t>
+      </w:r>
+      <w:r>
+        <w:t xml:space="preserve">146, 1999–2049.</w:t>
+      </w:r>
+    </w:p>
+    <w:p>
+      <w:pPr>
+        <w:pStyle w:val="BodyText"/>
+      </w:pPr>
+      <w:r>
+        <w:t xml:space="preserve">Hsu, S. A., Meindl, E. A. &amp; Gilhousen, D. B. (1994). Determining the</w:t>
+      </w:r>
+      <w:r>
+        <w:t xml:space="preserve"> </w:t>
+      </w:r>
+      <w:r>
+        <w:t xml:space="preserve">power-law wind-profile exponent under near-neutral stability conditions at</w:t>
+      </w:r>
+      <w:r>
+        <w:t xml:space="preserve"> </w:t>
+      </w:r>
+      <w:r>
+        <w:t xml:space="preserve">sea.</w:t>
+      </w:r>
+      <w:r>
+        <w:t xml:space="preserve"> </w:t>
       </w:r>
       <w:r>
         <w:rPr>
           <w:iCs/>
           <w:i/>
         </w:rPr>
+        <w:t xml:space="preserve">Journal of Applied Meteorology</w:t>
+      </w:r>
+      <w:r>
+        <w:t xml:space="preserve"> </w:t>
+      </w:r>
+      <w:r>
+        <w:t xml:space="preserve">33, 757–765.</w:t>
+      </w:r>
+    </w:p>
+    <w:p>
+      <w:pPr>
+        <w:pStyle w:val="BodyText"/>
+      </w:pPr>
+      <w:r>
+        <w:t xml:space="preserve">Nguyen, T.-V., Pierobon, L., Elmegaard, B., Haglind, F., Breuhaus, P. &amp;</w:t>
+      </w:r>
+      <w:r>
+        <w:t xml:space="preserve"> </w:t>
+      </w:r>
+      <w:r>
+        <w:t xml:space="preserve">Voldsund, M. (2013). Exergetic assessment of energy systems on North Sea oil</w:t>
+      </w:r>
+      <w:r>
+        <w:t xml:space="preserve"> </w:t>
+      </w:r>
+      <w:r>
+        <w:t xml:space="preserve">and gas platforms.</w:t>
+      </w:r>
+      <w:r>
         <w:t xml:space="preserve"> </w:t>
       </w:r>
       <w:r>
@@ -3537,13 +3071,13 @@
           <w:iCs/>
           <w:i/>
         </w:rPr>
-        <w:t xml:space="preserve">the Royal Meteorological Society</w:t>
-      </w:r>
-      <w:r>
-        <w:t xml:space="preserve"> </w:t>
-      </w:r>
-      <w:r>
-        <w:t xml:space="preserve">146, 1999–2049.</w:t>
+        <w:t xml:space="preserve">Energy</w:t>
+      </w:r>
+      <w:r>
+        <w:t xml:space="preserve"> </w:t>
+      </w:r>
+      <w:r>
+        <w:t xml:space="preserve">62, 23–36. doi:10.1016/j.energy.2013.03.011.</w:t>
       </w:r>
     </w:p>
     <w:p>
@@ -3551,19 +3085,7 @@
         <w:pStyle w:val="BodyText"/>
       </w:pPr>
       <w:r>
-        <w:t xml:space="preserve">Hsu, S. A., Meindl, E. A. &amp; Gilhousen, D. B. (1994). Determining the</w:t>
-      </w:r>
-      <w:r>
-        <w:t xml:space="preserve"> </w:t>
-      </w:r>
-      <w:r>
-        <w:t xml:space="preserve">power-law wind-profile exponent under near-neutral stability conditions at</w:t>
-      </w:r>
-      <w:r>
-        <w:t xml:space="preserve"> </w:t>
-      </w:r>
-      <w:r>
-        <w:t xml:space="preserve">sea.</w:t>
+        <w:t xml:space="preserve">Offshore Norge (2024).</w:t>
       </w:r>
       <w:r>
         <w:t xml:space="preserve"> </w:t>
@@ -3573,13 +3095,10 @@
           <w:iCs/>
           <w:i/>
         </w:rPr>
-        <w:t xml:space="preserve">Journal of Applied Meteorology</w:t>
-      </w:r>
-      <w:r>
-        <w:t xml:space="preserve"> </w:t>
-      </w:r>
-      <w:r>
-        <w:t xml:space="preserve">33, 757–765.</w:t>
+        <w:t xml:space="preserve">Climate and environmental report 2024</w:t>
+      </w:r>
+      <w:r>
+        <w:t xml:space="preserve">.</w:t>
       </w:r>
     </w:p>
     <w:p>
@@ -3587,13 +3106,13 @@
         <w:pStyle w:val="BodyText"/>
       </w:pPr>
       <w:r>
-        <w:t xml:space="preserve">Nguyen, T.-V. et al. (2013). Exergetic assessment of energy systems on North</w:t>
-      </w:r>
-      <w:r>
-        <w:t xml:space="preserve"> </w:t>
-      </w:r>
-      <w:r>
-        <w:t xml:space="preserve">Sea oil and gas platforms.</w:t>
+        <w:t xml:space="preserve">Sharqawy, M. H., Lienhard, J. H. &amp; Zubair, S. M. (2010). Thermophysical</w:t>
+      </w:r>
+      <w:r>
+        <w:t xml:space="preserve"> </w:t>
+      </w:r>
+      <w:r>
+        <w:t xml:space="preserve">properties of seawater.</w:t>
       </w:r>
       <w:r>
         <w:t xml:space="preserve"> </w:t>
@@ -3603,10 +3122,13 @@
           <w:iCs/>
           <w:i/>
         </w:rPr>
-        <w:t xml:space="preserve">Energy</w:t>
-      </w:r>
-      <w:r>
-        <w:t xml:space="preserve">.</w:t>
+        <w:t xml:space="preserve">Desalination and Water Treatment</w:t>
+      </w:r>
+      <w:r>
+        <w:t xml:space="preserve"> </w:t>
+      </w:r>
+      <w:r>
+        <w:t xml:space="preserve">16, 354–380.</w:t>
       </w:r>
     </w:p>
     <w:p>
@@ -3614,7 +3136,13 @@
         <w:pStyle w:val="BodyText"/>
       </w:pPr>
       <w:r>
-        <w:t xml:space="preserve">Offshore Norge (2024).</w:t>
+        <w:t xml:space="preserve">Svendsen, H. G. et al. (2023). The Low Emission Oil and Gas Open reference</w:t>
+      </w:r>
+      <w:r>
+        <w:t xml:space="preserve"> </w:t>
+      </w:r>
+      <w:r>
+        <w:t xml:space="preserve">platform – an off-grid energy system for renewable integration studies.</w:t>
       </w:r>
       <w:r>
         <w:t xml:space="preserve"> </w:t>
@@ -3624,10 +3152,10 @@
           <w:iCs/>
           <w:i/>
         </w:rPr>
-        <w:t xml:space="preserve">Climate and environmental report 2024</w:t>
-      </w:r>
-      <w:r>
-        <w:t xml:space="preserve">.</w:t>
+        <w:t xml:space="preserve">IET Energy Systems Integration</w:t>
+      </w:r>
+      <w:r>
+        <w:t xml:space="preserve">. doi:10.1049/esi2.12085.</w:t>
       </w:r>
     </w:p>
     <w:p>
@@ -3635,13 +3163,19 @@
         <w:pStyle w:val="BodyText"/>
       </w:pPr>
       <w:r>
-        <w:t xml:space="preserve">Sharqawy, M. H., Lienhard, J. H. &amp; Zubair, S. M. (2010). Thermophysical</w:t>
-      </w:r>
-      <w:r>
-        <w:t xml:space="preserve"> </w:t>
-      </w:r>
-      <w:r>
-        <w:t xml:space="preserve">properties of seawater.</w:t>
+        <w:t xml:space="preserve">Voldsund, M., Ertesvåg, I. S., He, W. &amp; Kjelstrup, S. (2013). Exergy analysis</w:t>
+      </w:r>
+      <w:r>
+        <w:t xml:space="preserve"> </w:t>
+      </w:r>
+      <w:r>
+        <w:t xml:space="preserve">of the oil and gas processing on a North Sea oil platform a real production</w:t>
+      </w:r>
+      <w:r>
+        <w:t xml:space="preserve"> </w:t>
+      </w:r>
+      <w:r>
+        <w:t xml:space="preserve">day.</w:t>
       </w:r>
       <w:r>
         <w:t xml:space="preserve"> </w:t>
@@ -3651,13 +3185,13 @@
           <w:iCs/>
           <w:i/>
         </w:rPr>
-        <w:t xml:space="preserve">Desalination and Water Treatment</w:t>
-      </w:r>
-      <w:r>
-        <w:t xml:space="preserve"> </w:t>
-      </w:r>
-      <w:r>
-        <w:t xml:space="preserve">16, 354–380.</w:t>
+        <w:t xml:space="preserve">Energy</w:t>
+      </w:r>
+      <w:r>
+        <w:t xml:space="preserve"> </w:t>
+      </w:r>
+      <w:r>
+        <w:t xml:space="preserve">55, 716–727. doi:10.1016/j.energy.2013.02.038.</w:t>
       </w:r>
     </w:p>
     <w:p>
@@ -3665,13 +3199,25 @@
         <w:pStyle w:val="BodyText"/>
       </w:pPr>
       <w:r>
-        <w:t xml:space="preserve">Svendsen, H. G. et al. (2023). The Low Emission Oil and Gas Open reference</w:t>
-      </w:r>
-      <w:r>
-        <w:t xml:space="preserve"> </w:t>
-      </w:r>
-      <w:r>
-        <w:t xml:space="preserve">platform – an off-grid energy system for renewable integration studies.</w:t>
+        <w:t xml:space="preserve">Voldsund, M., Nguyen, T.-V., Elmegaard, B., Ertesvåg, I. S., Røsjorde, A.,</w:t>
+      </w:r>
+      <w:r>
+        <w:t xml:space="preserve"> </w:t>
+      </w:r>
+      <w:r>
+        <w:t xml:space="preserve">Jøssang, K. &amp; Kjelstrup, S. (2014). Exergy destruction and losses on four</w:t>
+      </w:r>
+      <w:r>
+        <w:t xml:space="preserve"> </w:t>
+      </w:r>
+      <w:r>
+        <w:t xml:space="preserve">North Sea offshore platforms: a comparative study of the oil and gas</w:t>
+      </w:r>
+      <w:r>
+        <w:t xml:space="preserve"> </w:t>
+      </w:r>
+      <w:r>
+        <w:t xml:space="preserve">processing plants.</w:t>
       </w:r>
       <w:r>
         <w:t xml:space="preserve"> </w:t>
@@ -3681,10 +3227,13 @@
           <w:iCs/>
           <w:i/>
         </w:rPr>
-        <w:t xml:space="preserve">IET Energy Systems Integration</w:t>
-      </w:r>
-      <w:r>
-        <w:t xml:space="preserve">. doi:10.1049/esi2.12085.</w:t>
+        <w:t xml:space="preserve">Energy</w:t>
+      </w:r>
+      <w:r>
+        <w:t xml:space="preserve"> </w:t>
+      </w:r>
+      <w:r>
+        <w:t xml:space="preserve">74, 45–58. doi:10.1016/j.energy.2014.02.080.</w:t>
       </w:r>
     </w:p>
     <w:p>
@@ -3692,160 +3241,73 @@
         <w:pStyle w:val="BodyText"/>
       </w:pPr>
       <w:r>
-        <w:t xml:space="preserve">Voldsund, M., Ertesvåg, I. S., He, W. &amp; Kjelstrup, S. (2013). Exergy analysis</w:t>
-      </w:r>
-      <w:r>
-        <w:t xml:space="preserve"> </w:t>
-      </w:r>
-      <w:r>
-        <w:t xml:space="preserve">of the oil and gas processing on a North Sea oil platform a real production</w:t>
-      </w:r>
-      <w:r>
-        <w:t xml:space="preserve"> </w:t>
-      </w:r>
-      <w:r>
-        <w:t xml:space="preserve">day.</w:t>
-      </w:r>
-      <w:r>
-        <w:t xml:space="preserve"> </w:t>
-      </w:r>
+        <w:t xml:space="preserve">Westwood Global Energy (2022). Analysis of electrification and emissions on</w:t>
+      </w:r>
+      <w:r>
+        <w:t xml:space="preserve"> </w:t>
+      </w:r>
+      <w:r>
+        <w:t xml:space="preserve">the Norwegian continental shelf.</w:t>
+      </w:r>
+    </w:p>
+    <w:p>
+      <w:pPr>
+        <w:pStyle w:val="BodyText"/>
+      </w:pPr>
+      <w:r>
+        <w:t xml:space="preserve">Data: Copernicus Climate Change Service (ERA5); Norwegian Environment Agency,</w:t>
+      </w:r>
+      <w:r>
+        <w:t xml:space="preserve"> </w:t>
+      </w:r>
+      <w:r>
+        <w:t xml:space="preserve">Norskeutslipp (CompanyID 22311, 16791, 16790); Norwegian Offshore Directorate,</w:t>
+      </w:r>
+      <w:r>
+        <w:t xml:space="preserve"> </w:t>
+      </w:r>
+      <w:r>
+        <w:t xml:space="preserve">FactPages (field production, yearly).</w:t>
+      </w:r>
+    </w:p>
+    <w:p>
+      <w:pPr>
+        <w:pStyle w:val="BodyText"/>
+      </w:pPr>
       <w:r>
         <w:rPr>
           <w:iCs/>
           <w:i/>
         </w:rPr>
-        <w:t xml:space="preserve">Energy</w:t>
-      </w:r>
-      <w:r>
-        <w:t xml:space="preserve"> </w:t>
-      </w:r>
-      <w:r>
-        <w:t xml:space="preserve">55, 716–727.</w:t>
-      </w:r>
-    </w:p>
-    <w:p>
-      <w:pPr>
-        <w:pStyle w:val="BodyText"/>
-      </w:pPr>
-      <w:r>
-        <w:t xml:space="preserve">Westwood Global Energy (2022). Analysis of electrification and emissions on</w:t>
-      </w:r>
-      <w:r>
-        <w:t xml:space="preserve"> </w:t>
-      </w:r>
-      <w:r>
-        <w:t xml:space="preserve">the Norwegian continental shelf.</w:t>
-      </w:r>
-    </w:p>
-    <w:p>
-      <w:pPr>
-        <w:pStyle w:val="BodyText"/>
-      </w:pPr>
-      <w:r>
-        <w:t xml:space="preserve">ESMAP (2020).</w:t>
-      </w:r>
-      <w:r>
-        <w:t xml:space="preserve"> </w:t>
+        <w:t xml:space="preserve">Check before submission: Voldsund et al. (2013, 2014) and Nguyen et al.</w:t>
       </w:r>
       <w:r>
         <w:rPr>
           <w:iCs/>
           <w:i/>
         </w:rPr>
-        <w:t xml:space="preserve">Offshore Wind Technical Potential: Analysis and Maps</w:t>
-      </w:r>
-      <w:r>
-        <w:t xml:space="preserve">. World</w:t>
-      </w:r>
-      <w:r>
-        <w:t xml:space="preserve"> </w:t>
-      </w:r>
-      <w:r>
-        <w:t xml:space="preserve">Bank Energy Sector Management Assistance Program.</w:t>
-      </w:r>
-      <w:r>
-        <w:t xml:space="preserve"> </w:t>
-      </w:r>
-      <w:hyperlink r:id="rId30">
-        <w:r>
-          <w:rPr>
-            <w:rStyle w:val="Hyperlink"/>
-          </w:rPr>
-          <w:t xml:space="preserve">https://www.esmap.org/esmap_offshorewind_techpotential_analysis_maps</w:t>
-        </w:r>
-      </w:hyperlink>
-    </w:p>
-    <w:p>
-      <w:pPr>
-        <w:pStyle w:val="BodyText"/>
-      </w:pPr>
+        <w:t xml:space="preserve"> </w:t>
+      </w:r>
       <w:r>
         <w:rPr>
           <w:iCs/>
           <w:i/>
         </w:rPr>
-        <w:t xml:space="preserve">Wind patterns of coastal Tanzania</w:t>
-      </w:r>
-      <w:r>
-        <w:t xml:space="preserve"> </w:t>
-      </w:r>
-      <w:r>
-        <w:t xml:space="preserve">(University of Dar es Salaam</w:t>
-      </w:r>
-      <w:r>
-        <w:t xml:space="preserve"> </w:t>
-      </w:r>
-      <w:r>
-        <w:t xml:space="preserve">repository).</w:t>
-      </w:r>
-      <w:r>
-        <w:t xml:space="preserve"> </w:t>
-      </w:r>
-      <w:hyperlink r:id="rId31">
-        <w:r>
-          <w:rPr>
-            <w:rStyle w:val="Hyperlink"/>
-          </w:rPr>
-          <w:t xml:space="preserve">https://repository.udsm.ac.tz/items/2f0fb49f-1275-4710-b7f1-116e2bdf0264</w:t>
-        </w:r>
-      </w:hyperlink>
-      <w:r>
-        <w:t xml:space="preserve"> </w:t>
-      </w:r>
-      <w:r>
-        <w:t xml:space="preserve">(authors and year to be completed from the original).</w:t>
-      </w:r>
-    </w:p>
-    <w:p>
-      <w:pPr>
-        <w:pStyle w:val="BodyText"/>
-      </w:pPr>
-      <w:r>
-        <w:t xml:space="preserve">Data: Copernicus Climate Change Service (ERA5); Norwegian Environment Agency,</w:t>
-      </w:r>
-      <w:r>
-        <w:t xml:space="preserve"> </w:t>
-      </w:r>
-      <w:r>
-        <w:t xml:space="preserve">Norskeutslipp (CompanyID 22311, 16791, 16790); Norwegian Offshore Directorate,</w:t>
-      </w:r>
-      <w:r>
-        <w:t xml:space="preserve"> </w:t>
-      </w:r>
-      <w:r>
-        <w:t xml:space="preserve">FactPages (field production, yearly).</w:t>
-      </w:r>
-    </w:p>
-    <w:p>
-      <w:pPr>
-        <w:pStyle w:val="BodyText"/>
-      </w:pPr>
+        <w:t xml:space="preserve">(2013) have been checked against the original papers. The Johan Castberg</w:t>
+      </w:r>
       <w:r>
         <w:rPr>
           <w:iCs/>
           <w:i/>
         </w:rPr>
-        <w:t xml:space="preserve">Check before submission: references marked</w:t>
+        <w:t xml:space="preserve"> </w:t>
+      </w:r>
+      <w:r>
+        <w:rPr>
+          <w:iCs/>
+          <w:i/>
+        </w:rPr>
+        <w:t xml:space="preserve">PDO and the other items marked</w:t>
       </w:r>
       <w:r>
         <w:rPr>
@@ -3916,25 +3378,11 @@
           <w:iCs/>
           <w:i/>
         </w:rPr>
-        <w:t xml:space="preserve">were obtained from search summaries and</w:t>
-      </w:r>
-      <w:r>
-        <w:rPr>
-          <w:iCs/>
-          <w:i/>
-        </w:rPr>
-        <w:t xml:space="preserve"> </w:t>
-      </w:r>
-      <w:r>
-        <w:rPr>
-          <w:iCs/>
-          <w:i/>
-        </w:rPr>
-        <w:t xml:space="preserve">should be confirmed against the original documents.</w:t>
-      </w:r>
-    </w:p>
-    <w:bookmarkEnd w:id="32"/>
-    <w:bookmarkEnd w:id="33"/>
+        <w:t xml:space="preserve">were obtained from search summaries and should still be confirmed.</w:t>
+      </w:r>
+    </w:p>
+    <w:bookmarkEnd w:id="29"/>
+    <w:bookmarkEnd w:id="30"/>
     <w:sectPr/>
   </w:body>
 </w:document>
@@ -4248,9 +3696,6 @@
     <w:abstractNumId w:val="991"/>
   </w:num>
   <w:num w:numId="1006">
-    <w:abstractNumId w:val="991"/>
-  </w:num>
-  <w:num w:numId="1007">
     <w:abstractNumId w:val="991"/>
   </w:num>
 </w:numbering>

</xml_diff>